<commit_message>
SIM: tpi caser — nombre de fantasia definido como "Caser" en la entrega de avance
La empresa confirmo usar solo la marca comercial (Caser), sin razon
social ficticia separada.

Co-Authored-By: Claude Sonnet 5 <noreply@anthropic.com>
</commit_message>
<xml_diff>
--- a/materias/SIM/entregables/TPI/caser/EspecificacionModelo_GRUPO_XX.docx
+++ b/materias/SIM/entregables/TPI/caser/EspecificacionModelo_GRUPO_XX.docx
@@ -74,7 +74,7 @@
           <w:szCs w:val="22"/>
           <w:lang w:val="es-AR"/>
         </w:rPr>
-        <w:t xml:space="preserve">Por pedido de confidencialidad de la empresa colaboradora, se usa en todo el documento el nombre ficticio </w:t>
+        <w:t xml:space="preserve">Por pedido de la empresa colaboradora, en todo el documento se usa únicamente su marca comercial, </w:t>
       </w:r>
       <w:r>
         <w:rPr>
@@ -86,39 +86,17 @@
           <w:szCs w:val="22"/>
           <w:lang w:val="es-AR"/>
         </w:rPr>
-        <w:t xml:space="preserve">Fijamet SRL</w:t>
-      </w:r>
-      <w:r>
-        <w:rPr>
-          <w:rFonts w:ascii="Lexend" w:cs="Lexend" w:eastAsia="Lexend" w:hAnsi="Lexend"/>
-          <w:color w:val="1A1A1A"/>
-          <w:sz w:val="22"/>
-          <w:szCs w:val="22"/>
-          <w:lang w:val="es-AR"/>
-        </w:rPr>
-        <w:t xml:space="preserve"> (marca </w:t>
-      </w:r>
-      <w:r>
-        <w:rPr>
-          <w:rFonts w:ascii="Lexend" w:cs="Lexend" w:eastAsia="Lexend" w:hAnsi="Lexend"/>
-          <w:b/>
-          <w:bCs/>
-          <w:color w:val="1A1A1A"/>
-          <w:sz w:val="22"/>
-          <w:szCs w:val="22"/>
-          <w:lang w:val="es-AR"/>
-        </w:rPr>
-        <w:t xml:space="preserve">FIJAMET</w:t>
-      </w:r>
-      <w:r>
-        <w:rPr>
-          <w:rFonts w:ascii="Lexend" w:cs="Lexend" w:eastAsia="Lexend" w:hAnsi="Lexend"/>
-          <w:color w:val="1A1A1A"/>
-          <w:sz w:val="22"/>
-          <w:szCs w:val="22"/>
-          <w:lang w:val="es-AR"/>
-        </w:rPr>
-        <w:t xml:space="preserve">) en lugar del real, y los valores monetarios se presentan tal como se relevaron — se convertirán a números índice recién en el informe final, cuando el conjunto de datos esté cerrado.</w:t>
+        <w:t xml:space="preserve">Caser</w:t>
+      </w:r>
+      <w:r>
+        <w:rPr>
+          <w:rFonts w:ascii="Lexend" w:cs="Lexend" w:eastAsia="Lexend" w:hAnsi="Lexend"/>
+          <w:color w:val="1A1A1A"/>
+          <w:sz w:val="22"/>
+          <w:szCs w:val="22"/>
+          <w:lang w:val="es-AR"/>
+        </w:rPr>
+        <w:t xml:space="preserve">, y no la razón social real. Los valores monetarios se presentan tal como se relevaron — se convertirán a números índice recién en el informe final, cuando el conjunto de datos esté cerrado.</w:t>
       </w:r>
     </w:p>
     <w:p>
@@ -160,7 +138,7 @@
           <w:szCs w:val="22"/>
           <w:lang w:val="es-AR"/>
         </w:rPr>
-        <w:t xml:space="preserve">La cadena de producción interna de Fijamet SRL, una PyME metalúrgica fabricante de tornillos y elementos de fijación, acotada al subconjunto de artículos fabricados bajo la marca propia (no se incluyen accesorios comprados a terceros ni artículos importados) y centrada en el recurso que gobierna el tiempo de entrega de la mayoría de ellos: el horno de tratamiento térmico (cementación y temple).</w:t>
+        <w:t xml:space="preserve">La cadena de producción interna de Caser, una PyME metalúrgica fabricante de tornillos y elementos de fijación, acotada al subconjunto de artículos fabricados bajo la marca propia (no se incluyen accesorios comprados a terceros ni artículos importados) y centrada en el recurso que gobierna el tiempo de entrega de la mayoría de ellos: el horno de tratamiento térmico (cementación y temple).</w:t>
       </w:r>
     </w:p>
     <w:p>
@@ -197,7 +175,7 @@
           <w:szCs w:val="22"/>
           <w:lang w:val="es-AR"/>
         </w:rPr>
-        <w:t xml:space="preserve">Fijamet SRL atraviesa una reestructuración financiera y opera con muy baja capacidad ociosa de capital: no mantiene stock de seguridad reglado para prácticamente ningún artículo — la fabricación es, por decantación, contra pedido. El horno de tratamiento térmico funciona de forma intermitente, no continua, porque encenderlo tiene un costo fijo grande (36 h de calentamiento y 48 h de enfriamiento durante las cuales no trata nada) frente a una capacidad de proceso relativamente chica (del orden de 17 unidades de transporte interno —ULI— por día, en tres turnos de 8 h). Esa asimetría hace que la decisión de </w:t>
+        <w:t xml:space="preserve">Caser atraviesa una reestructuración financiera y opera con muy baja capacidad ociosa de capital: no mantiene stock de seguridad reglado para prácticamente ningún artículo — la fabricación es, por decantación, contra pedido. El horno de tratamiento térmico funciona de forma intermitente, no continua, porque encenderlo tiene un costo fijo grande (36 h de calentamiento y 48 h de enfriamiento durante las cuales no trata nada) frente a una capacidad de proceso relativamente chica (del orden de 17 unidades de transporte interno —ULI— por día, en tres turnos de 8 h). Esa asimetría hace que la decisión de </w:t>
       </w:r>
       <w:r>
         <w:rPr>

</xml_diff>

<commit_message>
SIM: tpi caser — kg por ULI resuelto (las columnas estan en millares)
La empresa confirmo que Cant. x U.L.I. y P. Pieza en Seguimiento TR
ulis estan en millares, no en piezas sueltas. kg/ULI = Cant. x U.L.I.
x P. Pieza directo (sin dividir por mil). Media 143 kg/ULI sobre 310
articulos, reconcilia bien contra la capacidad instalada del brief
inicial. Cierra el ultimo pendiente tecnico del horno.

Co-Authored-By: Claude Sonnet 5 <noreply@anthropic.com>
</commit_message>
<xml_diff>
--- a/materias/SIM/entregables/TPI/caser/EspecificacionModelo_GRUPO_XX.docx
+++ b/materias/SIM/entregables/TPI/caser/EspecificacionModelo_GRUPO_XX.docx
@@ -2643,7 +2643,7 @@
                 <w:szCs w:val="18"/>
                 <w:lang w:val="es-AR"/>
               </w:rPr>
-              <w:t xml:space="preserve">Piezas y kg por ULI, por artículo</w:t>
+              <w:t xml:space="preserve">Kg por ULI, por artículo</w:t>
             </w:r>
           </w:p>
         </w:tc>
@@ -2673,7 +2673,7 @@
                 <w:szCs w:val="18"/>
                 <w:lang w:val="es-AR"/>
               </w:rPr>
-              <w:t xml:space="preserve">Parcial — depende de la relación lata↔ULI, no confirmada todavía</w:t>
+              <w:t xml:space="preserve">✅ Resuelto (28/09/2026): 143 kg/ULI en promedio (mediana 136, rango 5,9-362,5 sobre 310 artículos). Con el umbral de 75 ULI, una campaña mueve ≈10 t — ≈17-25 % de la capacidad instalada, consistente con planta subutilizada</w:t>
             </w:r>
           </w:p>
         </w:tc>
@@ -2697,13 +2697,13 @@
             </w:pPr>
             <w:r>
               <w:rPr>
-                <w:rFonts w:ascii="Lexend" w:cs="Lexend" w:eastAsia="Lexend" w:hAnsi="Lexend"/>
-                <w:color w:val="1A1A1A"/>
-                <w:sz w:val="18"/>
-                <w:szCs w:val="18"/>
-                <w:lang w:val="es-AR"/>
-              </w:rPr>
-              <w:t xml:space="preserve">Planillas de oficina técnica</w:t>
+                <w:rFonts w:ascii="Consolas" w:cs="Consolas" w:eastAsia="Consolas" w:hAnsi="Consolas"/>
+                <w:color w:val="1A1A1A"/>
+                <w:sz w:val="16"/>
+                <w:szCs w:val="16"/>
+                <w:lang w:val="es-AR"/>
+              </w:rPr>
+              <w:t xml:space="preserve">Seguimiento TR ulis</w:t>
             </w:r>
           </w:p>
         </w:tc>
@@ -4188,7 +4188,7 @@
                 <w:szCs w:val="18"/>
                 <w:lang w:val="es-AR"/>
               </w:rPr>
-              <w:t xml:space="preserve">🟡 Parcial — falta confirmar la relación lata↔ULI</w:t>
+              <w:t xml:space="preserve">✅ Resuelto (28/09/2026) — 143 kg/ULI en promedio</w:t>
             </w:r>
           </w:p>
         </w:tc>
@@ -4212,13 +4212,13 @@
             </w:pPr>
             <w:r>
               <w:rPr>
-                <w:rFonts w:ascii="Lexend" w:cs="Lexend" w:eastAsia="Lexend" w:hAnsi="Lexend"/>
-                <w:color w:val="1A1A1A"/>
-                <w:sz w:val="18"/>
-                <w:szCs w:val="18"/>
-                <w:lang w:val="es-AR"/>
-              </w:rPr>
-              <w:t xml:space="preserve">Ficha técnica de artículos</w:t>
+                <w:rFonts w:ascii="Consolas" w:cs="Consolas" w:eastAsia="Consolas" w:hAnsi="Consolas"/>
+                <w:color w:val="1A1A1A"/>
+                <w:sz w:val="16"/>
+                <w:szCs w:val="16"/>
+                <w:lang w:val="es-AR"/>
+              </w:rPr>
+              <w:t xml:space="preserve">Seguimiento TR ulis</w:t>
             </w:r>
           </w:p>
         </w:tc>
@@ -5736,7 +5736,7 @@
           <w:szCs w:val="22"/>
           <w:lang w:val="es-AR"/>
         </w:rPr>
-        <w:t xml:space="preserve">La relación kg/ULI exacta, la política de stock vs. contra pedido si la empresa la tuviera para algún artículo elegido, y el precio de 5 artículos de alto volumen todavía sin listar oficialmente.</w:t>
+        <w:t xml:space="preserve">El precio de 5 artículos de alto volumen todavía sin listar oficialmente, y si alguno de los artículos elegidos es una de las excepciones que sí llevan stock.</w:t>
       </w:r>
     </w:p>
     <w:p>
@@ -5757,7 +5757,7 @@
           <w:szCs w:val="22"/>
           <w:lang w:val="es-AR"/>
         </w:rPr>
-        <w:t xml:space="preserve">La elección final de los 10 a 30 artículos representativos del modelo (el criterio de selección está definido; falta ejecutarlo).</w:t>
+        <w:t xml:space="preserve">Confirmar la elección final de los 10 a 30 artículos representativos (hay una propuesta de 15 armada y pendiente de validar con la empresa).</w:t>
       </w:r>
     </w:p>
     <w:p>

</xml_diff>